<commit_message>
Hallazgos del analisis de BI y conclusiones basadas en los reportes
</commit_message>
<xml_diff>
--- a/Fase_3/Conclusiones/Evaluación de Objetivos, Conclusiones y Escalabilidad.docx
+++ b/Fase_3/Conclusiones/Evaluación de Objetivos, Conclusiones y Escalabilidad.docx
@@ -35,7 +35,14 @@
           <w:rFonts w:ascii="Times New Roman" w:eastAsia="Times New Roman" w:hAnsi="Times New Roman" w:cs="Times New Roman"/>
           <w:sz w:val="24"/>
         </w:rPr>
-        <w:t>La evaluación utiliza únicamente registros de la base raiz_artesanal_db al 20 de octubre de 2026: 7 pedidos de venta confirmados (S00025 y S00026 por venta directa; S00027 a S00031 por la tienda en línea), sus facturas y entregas, el pipeline del CRM, el conteo físico de inventario y la encuesta de satisfacción. Los indicadores se pueden recalcular con el archivo Fase_3/KPIs/verificar_kpis.py.</w:t>
+        <w:t>La evaluación utiliza únicamente registros de la base raiz_artesanal_db al 20 de octubre de 2026: 7 pedidos de venta confirmados (S00025 y S00026 por venta directa; S00027 a S00031 por la tienda en línea), sus facturas y entregas, el pipeline del CRM, el conteo físico de inventario y la encuesta de satisfacción. Los mismos datos se analizan en los reportes de Business Intelligence de Metabase (Reporte de Inventario, Reporte de Ventas y Tablero de Control Gerencial), y los indicadores se pueden recalcular co</w:t>
+      </w:r>
+      <w:r>
+        <w:rPr>
+          <w:rFonts w:ascii="Times New Roman" w:eastAsia="Times New Roman" w:hAnsi="Times New Roman" w:cs="Times New Roman"/>
+          <w:sz w:val="24"/>
+        </w:rPr>
+        <w:t>n el archivo Fase_3/KPIs/verificar_kpis.py.</w:t>
       </w:r>
     </w:p>
     <w:tbl>
@@ -279,6 +286,351 @@
           <w:b/>
           <w:sz w:val="24"/>
         </w:rPr>
+        <w:t>Hallazgos del Análisis de BI</w:t>
+      </w:r>
+    </w:p>
+    <w:tbl>
+      <w:tblPr>
+        <w:tblW w:w="0" w:type="auto"/>
+        <w:tblBorders>
+          <w:top w:val="single" w:sz="4" w:space="0" w:color="000000"/>
+          <w:left w:val="single" w:sz="4" w:space="0" w:color="000000"/>
+          <w:bottom w:val="single" w:sz="4" w:space="0" w:color="000000"/>
+          <w:right w:val="single" w:sz="4" w:space="0" w:color="000000"/>
+          <w:insideH w:val="single" w:sz="4" w:space="0" w:color="000000"/>
+          <w:insideV w:val="single" w:sz="4" w:space="0" w:color="000000"/>
+        </w:tblBorders>
+        <w:tblLook w:val="04A0" w:firstRow="1" w:lastRow="0" w:firstColumn="1" w:lastColumn="0" w:noHBand="0" w:noVBand="1"/>
+      </w:tblPr>
+      <w:tblGrid>
+        <w:gridCol w:w="2490"/>
+        <w:gridCol w:w="3508"/>
+        <w:gridCol w:w="2830"/>
+      </w:tblGrid>
+      <w:tr>
+        <w:tc>
+          <w:tcPr>
+            <w:tcW w:w="2494" w:type="dxa"/>
+          </w:tcPr>
+          <w:p>
+            <w:r>
+              <w:rPr>
+                <w:rFonts w:ascii="Times New Roman" w:eastAsia="Times New Roman" w:hAnsi="Times New Roman" w:cs="Times New Roman"/>
+                <w:b/>
+                <w:sz w:val="18"/>
+              </w:rPr>
+              <w:t>Hallazgo</w:t>
+            </w:r>
+          </w:p>
+        </w:tc>
+        <w:tc>
+          <w:tcPr>
+            <w:tcW w:w="3515" w:type="dxa"/>
+          </w:tcPr>
+          <w:p>
+            <w:r>
+              <w:rPr>
+                <w:rFonts w:ascii="Times New Roman" w:eastAsia="Times New Roman" w:hAnsi="Times New Roman" w:cs="Times New Roman"/>
+                <w:b/>
+                <w:sz w:val="18"/>
+              </w:rPr>
+              <w:t>Dato del reporte</w:t>
+            </w:r>
+          </w:p>
+        </w:tc>
+        <w:tc>
+          <w:tcPr>
+            <w:tcW w:w="2835" w:type="dxa"/>
+          </w:tcPr>
+          <w:p>
+            <w:r>
+              <w:rPr>
+                <w:rFonts w:ascii="Times New Roman" w:eastAsia="Times New Roman" w:hAnsi="Times New Roman" w:cs="Times New Roman"/>
+                <w:b/>
+                <w:sz w:val="18"/>
+              </w:rPr>
+              <w:t>Implicación</w:t>
+            </w:r>
+          </w:p>
+        </w:tc>
+      </w:tr>
+      <w:tr>
+        <w:tc>
+          <w:tcPr>
+            <w:tcW w:w="2494" w:type="dxa"/>
+          </w:tcPr>
+          <w:p>
+            <w:r>
+              <w:rPr>
+                <w:rFonts w:ascii="Times New Roman" w:eastAsia="Times New Roman" w:hAnsi="Times New Roman" w:cs="Times New Roman"/>
+                <w:sz w:val="18"/>
+              </w:rPr>
+              <w:t>La ganancia se concentra en Decoración y Hogar</w:t>
+            </w:r>
+          </w:p>
+        </w:tc>
+        <w:tc>
+          <w:tcPr>
+            <w:tcW w:w="3515" w:type="dxa"/>
+          </w:tcPr>
+          <w:p>
+            <w:r>
+              <w:rPr>
+                <w:rFonts w:ascii="Times New Roman" w:eastAsia="Times New Roman" w:hAnsi="Times New Roman" w:cs="Times New Roman"/>
+                <w:sz w:val="18"/>
+              </w:rPr>
+              <w:t>76.9 % de la ganancia (Q 4,357.51 de Q 5,663.22) con solo 15.9 % de las unidades en inventario</w:t>
+            </w:r>
+          </w:p>
+        </w:tc>
+        <w:tc>
+          <w:tcPr>
+            <w:tcW w:w="2835" w:type="dxa"/>
+          </w:tcPr>
+          <w:p>
+            <w:r>
+              <w:rPr>
+                <w:rFonts w:ascii="Times New Roman" w:eastAsia="Times New Roman" w:hAnsi="Times New Roman" w:cs="Times New Roman"/>
+                <w:sz w:val="18"/>
+              </w:rPr>
+              <w:t>Es la familia que más rinde y la que tiene menos existencias disponibles</w:t>
+            </w:r>
+          </w:p>
+        </w:tc>
+      </w:tr>
+      <w:tr>
+        <w:tc>
+          <w:tcPr>
+            <w:tcW w:w="2494" w:type="dxa"/>
+          </w:tcPr>
+          <w:p>
+            <w:r>
+              <w:rPr>
+                <w:rFonts w:ascii="Times New Roman" w:eastAsia="Times New Roman" w:hAnsi="Times New Roman" w:cs="Times New Roman"/>
+                <w:sz w:val="18"/>
+              </w:rPr>
+              <w:t>Inventario inmovilizado en Accesorios y Textiles</w:t>
+            </w:r>
+          </w:p>
+        </w:tc>
+        <w:tc>
+          <w:tcPr>
+            <w:tcW w:w="3515" w:type="dxa"/>
+          </w:tcPr>
+          <w:p>
+            <w:r>
+              <w:rPr>
+                <w:rFonts w:ascii="Times New Roman" w:eastAsia="Times New Roman" w:hAnsi="Times New Roman" w:cs="Times New Roman"/>
+                <w:sz w:val="18"/>
+              </w:rPr>
+              <w:t>54.4 % de las unidades y Q 64,260.00 (70.5 % del valor del inventario), pero solo 8.6 % de las ventas</w:t>
+            </w:r>
+          </w:p>
+        </w:tc>
+        <w:tc>
+          <w:tcPr>
+            <w:tcW w:w="2835" w:type="dxa"/>
+          </w:tcPr>
+          <w:p>
+            <w:r>
+              <w:rPr>
+                <w:rFonts w:ascii="Times New Roman" w:eastAsia="Times New Roman" w:hAnsi="Times New Roman" w:cs="Times New Roman"/>
+                <w:sz w:val="18"/>
+              </w:rPr>
+              <w:t>Capital detenido en familias de baja rotación</w:t>
+            </w:r>
+          </w:p>
+        </w:tc>
+      </w:tr>
+      <w:tr>
+        <w:tc>
+          <w:tcPr>
+            <w:tcW w:w="2494" w:type="dxa"/>
+          </w:tcPr>
+          <w:p>
+            <w:r>
+              <w:rPr>
+                <w:rFonts w:ascii="Times New Roman" w:eastAsia="Times New Roman" w:hAnsi="Times New Roman" w:cs="Times New Roman"/>
+                <w:sz w:val="18"/>
+              </w:rPr>
+              <w:t>Los productos más vendidos están en stock bajo</w:t>
+            </w:r>
+          </w:p>
+        </w:tc>
+        <w:tc>
+          <w:tcPr>
+            <w:tcW w:w="3515" w:type="dxa"/>
+          </w:tcPr>
+          <w:p>
+            <w:r>
+              <w:rPr>
+                <w:rFonts w:ascii="Times New Roman" w:eastAsia="Times New Roman" w:hAnsi="Times New Roman" w:cs="Times New Roman"/>
+                <w:sz w:val="18"/>
+              </w:rPr>
+              <w:t>Set de 6 Individuales y Funda de Almohada (10 unidades vendidas cada uno) quedan con 5 unidades</w:t>
+            </w:r>
+          </w:p>
+        </w:tc>
+        <w:tc>
+          <w:tcPr>
+            <w:tcW w:w="2835" w:type="dxa"/>
+          </w:tcPr>
+          <w:p>
+            <w:r>
+              <w:rPr>
+                <w:rFonts w:ascii="Times New Roman" w:eastAsia="Times New Roman" w:hAnsi="Times New Roman" w:cs="Times New Roman"/>
+                <w:sz w:val="18"/>
+              </w:rPr>
+              <w:t>Riesgo de no atender el próximo pedido corporativo</w:t>
+            </w:r>
+          </w:p>
+        </w:tc>
+      </w:tr>
+      <w:tr>
+        <w:tc>
+          <w:tcPr>
+            <w:tcW w:w="2494" w:type="dxa"/>
+          </w:tcPr>
+          <w:p>
+            <w:r>
+              <w:rPr>
+                <w:rFonts w:ascii="Times New Roman" w:eastAsia="Times New Roman" w:hAnsi="Times New Roman" w:cs="Times New Roman"/>
+                <w:sz w:val="18"/>
+              </w:rPr>
+              <w:t>Reposición en camino</w:t>
+            </w:r>
+          </w:p>
+        </w:tc>
+        <w:tc>
+          <w:tcPr>
+            <w:tcW w:w="3515" w:type="dxa"/>
+          </w:tcPr>
+          <w:p>
+            <w:r>
+              <w:rPr>
+                <w:rFonts w:ascii="Times New Roman" w:eastAsia="Times New Roman" w:hAnsi="Times New Roman" w:cs="Times New Roman"/>
+                <w:sz w:val="18"/>
+              </w:rPr>
+              <w:t>Incensario y Plato Policromado tienen 16 unidades entrantes por la orden P00027</w:t>
+            </w:r>
+          </w:p>
+        </w:tc>
+        <w:tc>
+          <w:tcPr>
+            <w:tcW w:w="2835" w:type="dxa"/>
+          </w:tcPr>
+          <w:p>
+            <w:r>
+              <w:rPr>
+                <w:rFonts w:ascii="Times New Roman" w:eastAsia="Times New Roman" w:hAnsi="Times New Roman" w:cs="Times New Roman"/>
+                <w:sz w:val="18"/>
+              </w:rPr>
+              <w:t>8 de los 10 productos en stock bajo aún no tienen compra</w:t>
+            </w:r>
+          </w:p>
+        </w:tc>
+      </w:tr>
+      <w:tr>
+        <w:tc>
+          <w:tcPr>
+            <w:tcW w:w="2494" w:type="dxa"/>
+          </w:tcPr>
+          <w:p>
+            <w:r>
+              <w:rPr>
+                <w:rFonts w:ascii="Times New Roman" w:eastAsia="Times New Roman" w:hAnsi="Times New Roman" w:cs="Times New Roman"/>
+                <w:sz w:val="18"/>
+              </w:rPr>
+              <w:t>El canal corporativo domina</w:t>
+            </w:r>
+          </w:p>
+        </w:tc>
+        <w:tc>
+          <w:tcPr>
+            <w:tcW w:w="3515" w:type="dxa"/>
+          </w:tcPr>
+          <w:p>
+            <w:r>
+              <w:rPr>
+                <w:rFonts w:ascii="Times New Roman" w:eastAsia="Times New Roman" w:hAnsi="Times New Roman" w:cs="Times New Roman"/>
+                <w:sz w:val="18"/>
+              </w:rPr>
+              <w:t>77.3 % de las ventas; ticket corporativo de Q 3,890.00 en línea frente a Q 760.00 individual</w:t>
+            </w:r>
+          </w:p>
+        </w:tc>
+        <w:tc>
+          <w:tcPr>
+            <w:tcW w:w="2835" w:type="dxa"/>
+          </w:tcPr>
+          <w:p>
+            <w:r>
+              <w:rPr>
+                <w:rFonts w:ascii="Times New Roman" w:eastAsia="Times New Roman" w:hAnsi="Times New Roman" w:cs="Times New Roman"/>
+                <w:sz w:val="18"/>
+              </w:rPr>
+              <w:t>Las cotizaciones en línea deben priorizarse</w:t>
+            </w:r>
+          </w:p>
+        </w:tc>
+      </w:tr>
+      <w:tr>
+        <w:tc>
+          <w:tcPr>
+            <w:tcW w:w="2494" w:type="dxa"/>
+          </w:tcPr>
+          <w:p>
+            <w:r>
+              <w:rPr>
+                <w:rFonts w:ascii="Times New Roman" w:eastAsia="Times New Roman" w:hAnsi="Times New Roman" w:cs="Times New Roman"/>
+                <w:sz w:val="18"/>
+              </w:rPr>
+              <w:t>La tienda en línea ya aporta</w:t>
+            </w:r>
+          </w:p>
+        </w:tc>
+        <w:tc>
+          <w:tcPr>
+            <w:tcW w:w="3515" w:type="dxa"/>
+          </w:tcPr>
+          <w:p>
+            <w:r>
+              <w:rPr>
+                <w:rFonts w:ascii="Times New Roman" w:eastAsia="Times New Roman" w:hAnsi="Times New Roman" w:cs="Times New Roman"/>
+                <w:sz w:val="18"/>
+              </w:rPr>
+              <w:t>39.7 % de las ventas registradas en su primer día de operación</w:t>
+            </w:r>
+          </w:p>
+        </w:tc>
+        <w:tc>
+          <w:tcPr>
+            <w:tcW w:w="2835" w:type="dxa"/>
+          </w:tcPr>
+          <w:p>
+            <w:r>
+              <w:rPr>
+                <w:rFonts w:ascii="Times New Roman" w:eastAsia="Times New Roman" w:hAnsi="Times New Roman" w:cs="Times New Roman"/>
+                <w:sz w:val="18"/>
+              </w:rPr>
+              <w:t>El canal digital es viable y debe medirse en más periodos</w:t>
+            </w:r>
+          </w:p>
+        </w:tc>
+      </w:tr>
+    </w:tbl>
+    <w:p/>
+    <w:p>
+      <w:pPr>
+        <w:keepNext/>
+      </w:pPr>
+      <w:r>
+        <w:rPr>
+          <w:rFonts w:ascii="Times New Roman" w:eastAsia="Times New Roman" w:hAnsi="Times New Roman" w:cs="Times New Roman"/>
+          <w:b/>
+          <w:sz w:val="24"/>
+        </w:rPr>
+        <w:lastRenderedPageBreak/>
         <w:t>Evaluación de los Objetivos SMART de la Fase 1</w:t>
       </w:r>
     </w:p>
@@ -603,15 +955,7 @@
           <w:rFonts w:ascii="Times New Roman" w:eastAsia="Times New Roman" w:hAnsi="Times New Roman" w:cs="Times New Roman"/>
           <w:sz w:val="24"/>
         </w:rPr>
-        <w:t xml:space="preserve">El objetivo 1, que era la condición para todos los demás, se cumplió dentro del plazo. Los objetivos 3 y 4 tienen un horizonte de tres y seis meses de operación, por lo que en esta fase se evalúa su avance. El incremento de 35 % en ventas no puede medirse todavía porque el </w:t>
-      </w:r>
-      <w:r>
-        <w:rPr>
-          <w:rFonts w:ascii="Times New Roman" w:eastAsia="Times New Roman" w:hAnsi="Times New Roman" w:cs="Times New Roman"/>
-          <w:sz w:val="24"/>
-        </w:rPr>
-        <w:lastRenderedPageBreak/>
-        <w:t>sistema no contiene el historial de ventas manuales anterior al proyecto; se calculará al cierre del primer trimestre comparando los periodos registrados en Odoo.</w:t>
+        <w:t>El objetivo 1, que era la condición para todos los demás, se cumplió dentro del plazo. Los objetivos 3 y 4 tienen un horizonte de tres y seis meses de operación, por lo que en esta fase se evalúa su avance. El incremento de 35 % en ventas no puede medirse todavía porque el sistema no contiene el historial de ventas manuales anterior al proyecto; se calculará al cierre del primer trimestre comparando los periodos registrados en Odoo.</w:t>
       </w:r>
     </w:p>
     <w:p>
@@ -668,14 +1012,21 @@
           <w:b/>
           <w:sz w:val="24"/>
         </w:rPr>
-        <w:t xml:space="preserve">3. La demanda se concentra en Decoración y Hogar. </w:t>
+        <w:t xml:space="preserve">3. La demanda no coincide con el inventario. </w:t>
       </w:r>
       <w:r>
         <w:rPr>
           <w:rFonts w:ascii="Times New Roman" w:eastAsia="Times New Roman" w:hAnsi="Times New Roman" w:cs="Times New Roman"/>
           <w:sz w:val="24"/>
         </w:rPr>
-        <w:t>Esta familia representa Q 13,510.00 de ventas y 49 unidades, impulsada por pedidos de hoteles (cojines, caminos de mesa, individuales y fundas). Conviene asegurar su abastecimiento con puntos de reposición y acuerdos de compra con la Asociación Textil Comalapa.</w:t>
+        <w:t xml:space="preserve">El Reporte de Ventas muestra que Decoración y Hogar genera el 76.9 % de la ganancia, mientras el Reporte de Inventario muestra que esa familia solo tiene el 15.9 % de las unidades y dos de sus productos más vendidos ya están en stock bajo. En cambio, Accesorios y Cuero y Textiles concentran el 70.5 % del valor del inventario con solo el 8.6 % de las ventas. Se recomienda priorizar las compras de Decoración y Hogar a la Asociación Textil Comalapa y dirigir campañas de correo a mover los textiles y artículos </w:t>
+      </w:r>
+      <w:r>
+        <w:rPr>
+          <w:rFonts w:ascii="Times New Roman" w:eastAsia="Times New Roman" w:hAnsi="Times New Roman" w:cs="Times New Roman"/>
+          <w:sz w:val="24"/>
+        </w:rPr>
+        <w:t>de cuero.</w:t>
       </w:r>
     </w:p>
     <w:p>
@@ -685,6 +1036,7 @@
           <w:b/>
           <w:sz w:val="24"/>
         </w:rPr>
+        <w:lastRenderedPageBreak/>
         <w:t xml:space="preserve">4. El margen bruto es saludable. </w:t>
       </w:r>
       <w:r>
@@ -736,7 +1088,24 @@
           <w:b/>
           <w:sz w:val="24"/>
         </w:rPr>
-        <w:t xml:space="preserve">7. Lo pendiente depende del tiempo de operación. </w:t>
+        <w:t xml:space="preserve">7. El BI convierte los datos en decisiones. </w:t>
+      </w:r>
+      <w:r>
+        <w:rPr>
+          <w:rFonts w:ascii="Times New Roman" w:eastAsia="Times New Roman" w:hAnsi="Times New Roman" w:cs="Times New Roman"/>
+          <w:sz w:val="24"/>
+        </w:rPr>
+        <w:t>Los tableros de Metabase leen la misma base de Odoo, por lo que la gerencia ve en el momento las ventas, la ganancia, el stock bajo y los KPIs, y puede filtrarlos por fecha, canal, categoría o tipo de cliente sin depender de hojas de cálculo.</w:t>
+      </w:r>
+    </w:p>
+    <w:p>
+      <w:r>
+        <w:rPr>
+          <w:rFonts w:ascii="Times New Roman" w:eastAsia="Times New Roman" w:hAnsi="Times New Roman" w:cs="Times New Roman"/>
+          <w:b/>
+          <w:sz w:val="24"/>
+        </w:rPr>
+        <w:t xml:space="preserve">8. Lo pendiente depende del tiempo de operación. </w:t>
       </w:r>
       <w:r>
         <w:rPr>
@@ -932,7 +1301,6 @@
                 <w:rFonts w:ascii="Times New Roman" w:eastAsia="Times New Roman" w:hAnsi="Times New Roman" w:cs="Times New Roman"/>
                 <w:sz w:val="18"/>
               </w:rPr>
-              <w:lastRenderedPageBreak/>
               <w:t>Antes del lanzamiento</w:t>
             </w:r>
           </w:p>
@@ -1182,6 +1550,51 @@
                 <w:sz w:val="18"/>
               </w:rPr>
               <w:t>Medir el CSAT de forma continua</w:t>
+            </w:r>
+          </w:p>
+        </w:tc>
+      </w:tr>
+      <w:tr>
+        <w:tc>
+          <w:tcPr>
+            <w:tcW w:w="1701" w:type="dxa"/>
+          </w:tcPr>
+          <w:p>
+            <w:r>
+              <w:rPr>
+                <w:rFonts w:ascii="Times New Roman" w:eastAsia="Times New Roman" w:hAnsi="Times New Roman" w:cs="Times New Roman"/>
+                <w:sz w:val="18"/>
+              </w:rPr>
+              <w:lastRenderedPageBreak/>
+              <w:t>Primer trimestre</w:t>
+            </w:r>
+          </w:p>
+        </w:tc>
+        <w:tc>
+          <w:tcPr>
+            <w:tcW w:w="4535" w:type="dxa"/>
+          </w:tcPr>
+          <w:p>
+            <w:r>
+              <w:rPr>
+                <w:rFonts w:ascii="Times New Roman" w:eastAsia="Times New Roman" w:hAnsi="Times New Roman" w:cs="Times New Roman"/>
+                <w:sz w:val="18"/>
+              </w:rPr>
+              <w:t>Suscripciones de Metabase que envíen por correo el Reporte de Inventario cada semana y alertas cuando un producto llegue al punto de reposición</w:t>
+            </w:r>
+          </w:p>
+        </w:tc>
+        <w:tc>
+          <w:tcPr>
+            <w:tcW w:w="2608" w:type="dxa"/>
+          </w:tcPr>
+          <w:p>
+            <w:r>
+              <w:rPr>
+                <w:rFonts w:ascii="Times New Roman" w:eastAsia="Times New Roman" w:hAnsi="Times New Roman" w:cs="Times New Roman"/>
+                <w:sz w:val="18"/>
+              </w:rPr>
+              <w:t>Anticipar las compras con base en datos</w:t>
             </w:r>
           </w:p>
         </w:tc>
@@ -2115,25 +2528,25 @@
       </w:pPr>
     </w:lvl>
   </w:abstractNum>
-  <w:num w:numId="1" w16cid:durableId="1211501839">
+  <w:num w:numId="1" w16cid:durableId="1756315118">
     <w:abstractNumId w:val="4"/>
   </w:num>
-  <w:num w:numId="2" w16cid:durableId="797573197">
+  <w:num w:numId="2" w16cid:durableId="1965235663">
     <w:abstractNumId w:val="6"/>
   </w:num>
-  <w:num w:numId="3" w16cid:durableId="301350224">
+  <w:num w:numId="3" w16cid:durableId="1550612220">
     <w:abstractNumId w:val="2"/>
   </w:num>
-  <w:num w:numId="4" w16cid:durableId="244923877">
+  <w:num w:numId="4" w16cid:durableId="467363023">
     <w:abstractNumId w:val="5"/>
   </w:num>
-  <w:num w:numId="5" w16cid:durableId="765348953">
+  <w:num w:numId="5" w16cid:durableId="33120118">
     <w:abstractNumId w:val="1"/>
   </w:num>
-  <w:num w:numId="6" w16cid:durableId="1777603960">
+  <w:num w:numId="6" w16cid:durableId="1023021190">
     <w:abstractNumId w:val="3"/>
   </w:num>
-  <w:num w:numId="7" w16cid:durableId="805007072">
+  <w:num w:numId="7" w16cid:durableId="142085736">
     <w:abstractNumId w:val="0"/>
   </w:num>
 </w:numbering>

</xml_diff>